<commit_message>
Backup before Windows reinstall
</commit_message>
<xml_diff>
--- a/UWAGA.docx
+++ b/UWAGA.docx
@@ -82,6 +82,1323 @@
         <w:t>config/ → konfiguracja.</w:t>
       </w:r>
     </w:p>
+    <w:p/>
+    <w:p>
+      <w:r>
+        <w:t xml:space="preserve">Zrobić automat </w:t>
+      </w:r>
+    </w:p>
+    <w:p>
+      <w:pPr>
+        <w:rPr>
+          <w:lang w:val="en-US"/>
+        </w:rPr>
+      </w:pPr>
+      <w:r>
+        <w:rPr>
+          <w:lang w:val="en-US"/>
+        </w:rPr>
+        <w:t>git add . git status git commit -m "Sprint F-002: add project vision" git push</w:t>
+      </w:r>
+    </w:p>
+    <w:p>
+      <w:pPr>
+        <w:rPr>
+          <w:lang w:val="en-US"/>
+        </w:rPr>
+      </w:pPr>
+    </w:p>
+    <w:p>
+      <w:pPr>
+        <w:rPr>
+          <w:lang w:val="en-US"/>
+        </w:rPr>
+      </w:pPr>
+    </w:p>
+    <w:p>
+      <w:pPr>
+        <w:rPr>
+          <w:lang w:val="en-US"/>
+        </w:rPr>
+      </w:pPr>
+    </w:p>
+    <w:p>
+      <w:pPr>
+        <w:rPr>
+          <w:lang w:val="en-US"/>
+        </w:rPr>
+      </w:pPr>
+    </w:p>
+    <w:p>
+      <w:pPr>
+        <w:rPr>
+          <w:lang w:val="en-US"/>
+        </w:rPr>
+      </w:pPr>
+    </w:p>
+    <w:p>
+      <w:pPr>
+        <w:rPr>
+          <w:lang w:val="en-US"/>
+        </w:rPr>
+      </w:pPr>
+    </w:p>
+    <w:p>
+      <w:pPr>
+        <w:rPr>
+          <w:lang w:val="en-US"/>
+        </w:rPr>
+      </w:pPr>
+    </w:p>
+    <w:p>
+      <w:pPr>
+        <w:rPr>
+          <w:lang w:val="en-US"/>
+        </w:rPr>
+      </w:pPr>
+    </w:p>
+    <w:p>
+      <w:pPr>
+        <w:rPr>
+          <w:lang w:val="en-US"/>
+        </w:rPr>
+      </w:pPr>
+    </w:p>
+    <w:p>
+      <w:pPr>
+        <w:rPr>
+          <w:lang w:val="en-US"/>
+        </w:rPr>
+      </w:pPr>
+    </w:p>
+    <w:p>
+      <w:pPr>
+        <w:rPr>
+          <w:lang w:val="en-US"/>
+        </w:rPr>
+      </w:pPr>
+    </w:p>
+    <w:p>
+      <w:pPr>
+        <w:rPr>
+          <w:lang w:val="en-US"/>
+        </w:rPr>
+      </w:pPr>
+    </w:p>
+    <w:p>
+      <w:pPr>
+        <w:rPr>
+          <w:lang w:val="en-US"/>
+        </w:rPr>
+      </w:pPr>
+    </w:p>
+    <w:p>
+      <w:pPr>
+        <w:rPr>
+          <w:lang w:val="en-US"/>
+        </w:rPr>
+      </w:pPr>
+    </w:p>
+    <w:p>
+      <w:pPr>
+        <w:rPr>
+          <w:lang w:val="en-US"/>
+        </w:rPr>
+      </w:pPr>
+    </w:p>
+    <w:p>
+      <w:pPr>
+        <w:rPr>
+          <w:lang w:val="en-US"/>
+        </w:rPr>
+      </w:pPr>
+    </w:p>
+    <w:p>
+      <w:pPr>
+        <w:rPr>
+          <w:lang w:val="en-US"/>
+        </w:rPr>
+      </w:pPr>
+    </w:p>
+    <w:p>
+      <w:pPr>
+        <w:rPr>
+          <w:lang w:val="en-US"/>
+        </w:rPr>
+      </w:pPr>
+    </w:p>
+    <w:p>
+      <w:pPr>
+        <w:rPr>
+          <w:lang w:val="en-US"/>
+        </w:rPr>
+      </w:pPr>
+    </w:p>
+    <w:p>
+      <w:pPr>
+        <w:rPr>
+          <w:lang w:val="en-US"/>
+        </w:rPr>
+      </w:pPr>
+    </w:p>
+    <w:p>
+      <w:pPr>
+        <w:rPr>
+          <w:lang w:val="en-US"/>
+        </w:rPr>
+      </w:pPr>
+      <w:r>
+        <w:rPr>
+          <w:lang w:val="en-US"/>
+        </w:rPr>
+        <w:lastRenderedPageBreak/>
+        <w:t>ETAPY PRACY</w:t>
+      </w:r>
+    </w:p>
+    <w:p>
+      <w:pPr>
+        <w:rPr>
+          <w:lang w:val="en-US"/>
+        </w:rPr>
+      </w:pPr>
+    </w:p>
+    <w:p>
+      <w:pPr>
+        <w:rPr>
+          <w:b/>
+          <w:bCs/>
+        </w:rPr>
+      </w:pPr>
+      <w:r>
+        <w:rPr>
+          <w:b/>
+          <w:bCs/>
+        </w:rPr>
+        <w:t>Proponuję taką kolejność</w:t>
+      </w:r>
+    </w:p>
+    <w:p>
+      <w:pPr>
+        <w:rPr>
+          <w:b/>
+          <w:bCs/>
+        </w:rPr>
+      </w:pPr>
+      <w:r>
+        <w:rPr>
+          <w:b/>
+          <w:bCs/>
+        </w:rPr>
+        <w:t xml:space="preserve">ETAP 1 — Fundament (robimy teraz) </w:t>
+      </w:r>
+      <w:r>
+        <w:rPr>
+          <w:rFonts w:ascii="Segoe UI Emoji" w:hAnsi="Segoe UI Emoji" w:cs="Segoe UI Emoji"/>
+          <w:b/>
+          <w:bCs/>
+        </w:rPr>
+        <w:t>✅</w:t>
+      </w:r>
+    </w:p>
+    <w:p>
+      <w:pPr>
+        <w:numPr>
+          <w:ilvl w:val="0"/>
+          <w:numId w:val="2"/>
+        </w:numPr>
+      </w:pPr>
+      <w:r>
+        <w:t xml:space="preserve">Repozytorium </w:t>
+      </w:r>
+    </w:p>
+    <w:p>
+      <w:pPr>
+        <w:numPr>
+          <w:ilvl w:val="0"/>
+          <w:numId w:val="2"/>
+        </w:numPr>
+      </w:pPr>
+      <w:r>
+        <w:t xml:space="preserve">Dokumentacja </w:t>
+      </w:r>
+    </w:p>
+    <w:p>
+      <w:pPr>
+        <w:numPr>
+          <w:ilvl w:val="0"/>
+          <w:numId w:val="2"/>
+        </w:numPr>
+      </w:pPr>
+      <w:r>
+        <w:t xml:space="preserve">Architektura </w:t>
+      </w:r>
+    </w:p>
+    <w:p>
+      <w:pPr>
+        <w:numPr>
+          <w:ilvl w:val="0"/>
+          <w:numId w:val="2"/>
+        </w:numPr>
+      </w:pPr>
+      <w:r>
+        <w:t xml:space="preserve">Foundation Core </w:t>
+      </w:r>
+    </w:p>
+    <w:p>
+      <w:pPr>
+        <w:numPr>
+          <w:ilvl w:val="0"/>
+          <w:numId w:val="2"/>
+        </w:numPr>
+      </w:pPr>
+      <w:r>
+        <w:t xml:space="preserve">Konfiguracja </w:t>
+      </w:r>
+    </w:p>
+    <w:p>
+      <w:pPr>
+        <w:numPr>
+          <w:ilvl w:val="0"/>
+          <w:numId w:val="2"/>
+        </w:numPr>
+      </w:pPr>
+      <w:r>
+        <w:t xml:space="preserve">CLI </w:t>
+      </w:r>
+    </w:p>
+    <w:p>
+      <w:r>
+        <w:rPr>
+          <w:b/>
+          <w:bCs/>
+        </w:rPr>
+        <w:t>Efekt:</w:t>
+      </w:r>
+      <w:r>
+        <w:t xml:space="preserve"> Factory uruchamia się i ma stabilny szkielet.</w:t>
+      </w:r>
+    </w:p>
+    <w:p>
+      <w:r>
+        <w:pict w14:anchorId="74C62EE1">
+          <v:rect id="_x0000_i1067" style="width:0;height:1.5pt" o:hralign="center" o:hrstd="t" o:hr="t" fillcolor="#a0a0a0" stroked="f"/>
+        </w:pict>
+      </w:r>
+    </w:p>
+    <w:p>
+      <w:pPr>
+        <w:rPr>
+          <w:b/>
+          <w:bCs/>
+        </w:rPr>
+      </w:pPr>
+      <w:r>
+        <w:rPr>
+          <w:b/>
+          <w:bCs/>
+        </w:rPr>
+        <w:t>ETAP 2 — Agent Core (robimy zaraz po MVP)</w:t>
+      </w:r>
+    </w:p>
+    <w:p>
+      <w:pPr>
+        <w:rPr>
+          <w:lang w:val="en-US"/>
+        </w:rPr>
+      </w:pPr>
+      <w:r>
+        <w:rPr>
+          <w:lang w:val="en-US"/>
+        </w:rPr>
+        <w:t>Powstaną:</w:t>
+      </w:r>
+    </w:p>
+    <w:p>
+      <w:pPr>
+        <w:rPr>
+          <w:lang w:val="en-US"/>
+        </w:rPr>
+      </w:pPr>
+      <w:r>
+        <w:rPr>
+          <w:lang w:val="en-US"/>
+        </w:rPr>
+        <w:t>Planner</w:t>
+      </w:r>
+    </w:p>
+    <w:p>
+      <w:pPr>
+        <w:rPr>
+          <w:lang w:val="en-US"/>
+        </w:rPr>
+      </w:pPr>
+      <w:r>
+        <w:rPr>
+          <w:lang w:val="en-US"/>
+        </w:rPr>
+        <w:t>Executor</w:t>
+      </w:r>
+    </w:p>
+    <w:p>
+      <w:pPr>
+        <w:rPr>
+          <w:lang w:val="en-US"/>
+        </w:rPr>
+      </w:pPr>
+      <w:r>
+        <w:rPr>
+          <w:lang w:val="en-US"/>
+        </w:rPr>
+        <w:t>Context</w:t>
+      </w:r>
+    </w:p>
+    <w:p>
+      <w:pPr>
+        <w:rPr>
+          <w:lang w:val="en-US"/>
+        </w:rPr>
+      </w:pPr>
+      <w:r>
+        <w:rPr>
+          <w:lang w:val="en-US"/>
+        </w:rPr>
+        <w:t>Task</w:t>
+      </w:r>
+    </w:p>
+    <w:p>
+      <w:pPr>
+        <w:rPr>
+          <w:lang w:val="en-US"/>
+        </w:rPr>
+      </w:pPr>
+      <w:r>
+        <w:rPr>
+          <w:lang w:val="en-US"/>
+        </w:rPr>
+        <w:t>Workspace</w:t>
+      </w:r>
+    </w:p>
+    <w:p>
+      <w:r>
+        <w:t>Plugin Manager</w:t>
+      </w:r>
+    </w:p>
+    <w:p>
+      <w:r>
+        <w:rPr>
+          <w:b/>
+          <w:bCs/>
+        </w:rPr>
+        <w:t>Efekt:</w:t>
+      </w:r>
+      <w:r>
+        <w:t xml:space="preserve"> Factory zaczyna wykonywać zadania.</w:t>
+      </w:r>
+    </w:p>
+    <w:p>
+      <w:r>
+        <w:pict w14:anchorId="720151B1">
+          <v:rect id="_x0000_i1068" style="width:0;height:1.5pt" o:hralign="center" o:hrstd="t" o:hr="t" fillcolor="#a0a0a0" stroked="f"/>
+        </w:pict>
+      </w:r>
+    </w:p>
+    <w:p>
+      <w:pPr>
+        <w:rPr>
+          <w:b/>
+          <w:bCs/>
+        </w:rPr>
+      </w:pPr>
+      <w:r>
+        <w:rPr>
+          <w:b/>
+          <w:bCs/>
+        </w:rPr>
+        <w:t>ETAP 3 — Git Plugin</w:t>
+      </w:r>
+    </w:p>
+    <w:p>
+      <w:r>
+        <w:t>Dopiero tutaj.</w:t>
+      </w:r>
+    </w:p>
+    <w:p>
+      <w:pPr>
+        <w:rPr>
+          <w:lang w:val="en-US"/>
+        </w:rPr>
+      </w:pPr>
+      <w:r>
+        <w:rPr>
+          <w:lang w:val="en-US"/>
+        </w:rPr>
+        <w:t>Powstanie:</w:t>
+      </w:r>
+    </w:p>
+    <w:p>
+      <w:pPr>
+        <w:rPr>
+          <w:lang w:val="en-US"/>
+        </w:rPr>
+      </w:pPr>
+      <w:r>
+        <w:rPr>
+          <w:lang w:val="en-US"/>
+        </w:rPr>
+        <w:t>factory git status</w:t>
+      </w:r>
+    </w:p>
+    <w:p>
+      <w:pPr>
+        <w:rPr>
+          <w:lang w:val="en-US"/>
+        </w:rPr>
+      </w:pPr>
+      <w:r>
+        <w:rPr>
+          <w:lang w:val="en-US"/>
+        </w:rPr>
+        <w:t>factory git add</w:t>
+      </w:r>
+    </w:p>
+    <w:p>
+      <w:r>
+        <w:t>factory commit</w:t>
+      </w:r>
+    </w:p>
+    <w:p>
+      <w:r>
+        <w:t>factory push</w:t>
+      </w:r>
+    </w:p>
+    <w:p>
+      <w:r>
+        <w:t>Już w architekturze pluginów.</w:t>
+      </w:r>
+    </w:p>
+    <w:p>
+      <w:r>
+        <w:pict w14:anchorId="37A7D921">
+          <v:rect id="_x0000_i1069" style="width:0;height:1.5pt" o:hralign="center" o:hrstd="t" o:hr="t" fillcolor="#a0a0a0" stroked="f"/>
+        </w:pict>
+      </w:r>
+    </w:p>
+    <w:p>
+      <w:pPr>
+        <w:rPr>
+          <w:b/>
+          <w:bCs/>
+        </w:rPr>
+      </w:pPr>
+      <w:r>
+        <w:rPr>
+          <w:b/>
+          <w:bCs/>
+        </w:rPr>
+        <w:lastRenderedPageBreak/>
+        <w:t>ETAP 4 — Smart Git</w:t>
+      </w:r>
+    </w:p>
+    <w:p>
+      <w:r>
+        <w:t>Dopiero wtedy dodamy:</w:t>
+      </w:r>
+    </w:p>
+    <w:p>
+      <w:pPr>
+        <w:rPr>
+          <w:lang w:val="en-US"/>
+        </w:rPr>
+      </w:pPr>
+      <w:r>
+        <w:rPr>
+          <w:lang w:val="en-US"/>
+        </w:rPr>
+        <w:t>factory finish</w:t>
+      </w:r>
+    </w:p>
+    <w:p>
+      <w:pPr>
+        <w:rPr>
+          <w:lang w:val="en-US"/>
+        </w:rPr>
+      </w:pPr>
+      <w:r>
+        <w:rPr>
+          <w:lang w:val="en-US"/>
+        </w:rPr>
+        <w:t>który zrobi:</w:t>
+      </w:r>
+    </w:p>
+    <w:p>
+      <w:pPr>
+        <w:rPr>
+          <w:lang w:val="en-US"/>
+        </w:rPr>
+      </w:pPr>
+      <w:r>
+        <w:rPr>
+          <w:rFonts w:ascii="Segoe UI Symbol" w:hAnsi="Segoe UI Symbol" w:cs="Segoe UI Symbol"/>
+          <w:lang w:val="en-US"/>
+        </w:rPr>
+        <w:t>✓</w:t>
+      </w:r>
+      <w:r>
+        <w:rPr>
+          <w:lang w:val="en-US"/>
+        </w:rPr>
+        <w:t xml:space="preserve"> git add</w:t>
+      </w:r>
+    </w:p>
+    <w:p>
+      <w:pPr>
+        <w:rPr>
+          <w:lang w:val="en-US"/>
+        </w:rPr>
+      </w:pPr>
+      <w:r>
+        <w:rPr>
+          <w:rFonts w:ascii="Segoe UI Symbol" w:hAnsi="Segoe UI Symbol" w:cs="Segoe UI Symbol"/>
+          <w:lang w:val="en-US"/>
+        </w:rPr>
+        <w:t>✓</w:t>
+      </w:r>
+      <w:r>
+        <w:rPr>
+          <w:lang w:val="en-US"/>
+        </w:rPr>
+        <w:t xml:space="preserve"> tests</w:t>
+      </w:r>
+    </w:p>
+    <w:p>
+      <w:r>
+        <w:rPr>
+          <w:rFonts w:ascii="Segoe UI Symbol" w:hAnsi="Segoe UI Symbol" w:cs="Segoe UI Symbol"/>
+        </w:rPr>
+        <w:t>✓</w:t>
+      </w:r>
+      <w:r>
+        <w:t xml:space="preserve"> validation</w:t>
+      </w:r>
+    </w:p>
+    <w:p>
+      <w:r>
+        <w:rPr>
+          <w:rFonts w:ascii="Segoe UI Symbol" w:hAnsi="Segoe UI Symbol" w:cs="Segoe UI Symbol"/>
+        </w:rPr>
+        <w:t>✓</w:t>
+      </w:r>
+      <w:r>
+        <w:t xml:space="preserve"> commit</w:t>
+      </w:r>
+    </w:p>
+    <w:p>
+      <w:r>
+        <w:rPr>
+          <w:rFonts w:ascii="Segoe UI Symbol" w:hAnsi="Segoe UI Symbol" w:cs="Segoe UI Symbol"/>
+        </w:rPr>
+        <w:t>✓</w:t>
+      </w:r>
+      <w:r>
+        <w:t xml:space="preserve"> push</w:t>
+      </w:r>
+    </w:p>
+    <w:p>
+      <w:r>
+        <w:rPr>
+          <w:rFonts w:ascii="Segoe UI Symbol" w:hAnsi="Segoe UI Symbol" w:cs="Segoe UI Symbol"/>
+        </w:rPr>
+        <w:t>✓</w:t>
+      </w:r>
+      <w:r>
+        <w:t xml:space="preserve"> release</w:t>
+      </w:r>
+    </w:p>
+    <w:p>
+      <w:r>
+        <w:pict w14:anchorId="3D419B22">
+          <v:rect id="_x0000_i1070" style="width:0;height:1.5pt" o:hralign="center" o:hrstd="t" o:hr="t" fillcolor="#a0a0a0" stroked="f"/>
+        </w:pict>
+      </w:r>
+    </w:p>
+    <w:p>
+      <w:pPr>
+        <w:rPr>
+          <w:b/>
+          <w:bCs/>
+        </w:rPr>
+      </w:pPr>
+      <w:r>
+        <w:rPr>
+          <w:b/>
+          <w:bCs/>
+        </w:rPr>
+        <w:t>Dlaczego chcę to zrobić właśnie tak?</w:t>
+      </w:r>
+    </w:p>
+    <w:p>
+      <w:r>
+        <w:t xml:space="preserve">Bo chcę, żebyś </w:t>
+      </w:r>
+      <w:r>
+        <w:rPr>
+          <w:b/>
+          <w:bCs/>
+        </w:rPr>
+        <w:t>nigdy nie musiał przepisywać kodu</w:t>
+      </w:r>
+      <w:r>
+        <w:t>.</w:t>
+      </w:r>
+    </w:p>
+    <w:p>
+      <w:r>
+        <w:t>Każdy moduł ma być budowany raz i dobrze.</w:t>
+      </w:r>
+    </w:p>
+    <w:p>
+      <w:r>
+        <w:pict w14:anchorId="18E94085">
+          <v:rect id="_x0000_i1071" style="width:0;height:1.5pt" o:hralign="center" o:hrstd="t" o:hr="t" fillcolor="#a0a0a0" stroked="f"/>
+        </w:pict>
+      </w:r>
+    </w:p>
+    <w:p>
+      <w:pPr>
+        <w:rPr>
+          <w:b/>
+          <w:bCs/>
+        </w:rPr>
+      </w:pPr>
+      <w:r>
+        <w:rPr>
+          <w:b/>
+          <w:bCs/>
+        </w:rPr>
+        <w:t>Natomiast...</w:t>
+      </w:r>
+    </w:p>
+    <w:p>
+      <w:r>
+        <w:t xml:space="preserve">Jest jedna rzecz, którą </w:t>
+      </w:r>
+      <w:r>
+        <w:rPr>
+          <w:b/>
+          <w:bCs/>
+        </w:rPr>
+        <w:t>zrobimy już teraz</w:t>
+      </w:r>
+      <w:r>
+        <w:t>.</w:t>
+      </w:r>
+    </w:p>
+    <w:p>
+      <w:r>
+        <w:t>To będzie pierwsza funkcja Agent Core.</w:t>
+      </w:r>
+    </w:p>
+    <w:p>
+      <w:r>
+        <w:t>Nie Git.</w:t>
+      </w:r>
+    </w:p>
+    <w:p>
+      <w:r>
+        <w:t>Nie AI.</w:t>
+      </w:r>
+    </w:p>
+    <w:p>
+      <w:r>
+        <w:t>Tylko:</w:t>
+      </w:r>
+    </w:p>
+    <w:p>
+      <w:pPr>
+        <w:rPr>
+          <w:b/>
+          <w:bCs/>
+          <w:lang w:val="en-US"/>
+        </w:rPr>
+      </w:pPr>
+      <w:r>
+        <w:rPr>
+          <w:b/>
+          <w:bCs/>
+          <w:lang w:val="en-US"/>
+        </w:rPr>
+        <w:t>Task Engine</w:t>
+      </w:r>
+    </w:p>
+    <w:p>
+      <w:pPr>
+        <w:rPr>
+          <w:lang w:val="en-US"/>
+        </w:rPr>
+      </w:pPr>
+      <w:r>
+        <w:rPr>
+          <w:lang w:val="en-US"/>
+        </w:rPr>
+        <w:t>Przykład:</w:t>
+      </w:r>
+    </w:p>
+    <w:p>
+      <w:pPr>
+        <w:rPr>
+          <w:lang w:val="en-US"/>
+        </w:rPr>
+      </w:pPr>
+      <w:r>
+        <w:rPr>
+          <w:lang w:val="en-US"/>
+        </w:rPr>
+        <w:t>factory sprint create F-003</w:t>
+      </w:r>
+    </w:p>
+    <w:p>
+      <w:pPr>
+        <w:rPr>
+          <w:lang w:val="en-US"/>
+        </w:rPr>
+      </w:pPr>
+      <w:r>
+        <w:rPr>
+          <w:lang w:val="en-US"/>
+        </w:rPr>
+        <w:t>Agent odpowiada:</w:t>
+      </w:r>
+    </w:p>
+    <w:p>
+      <w:pPr>
+        <w:rPr>
+          <w:lang w:val="en-US"/>
+        </w:rPr>
+      </w:pPr>
+      <w:r>
+        <w:rPr>
+          <w:lang w:val="en-US"/>
+        </w:rPr>
+        <w:t>Sprint: F-003</w:t>
+      </w:r>
+    </w:p>
+    <w:p>
+      <w:pPr>
+        <w:rPr>
+          <w:lang w:val="en-US"/>
+        </w:rPr>
+      </w:pPr>
+    </w:p>
+    <w:p>
+      <w:pPr>
+        <w:rPr>
+          <w:lang w:val="en-US"/>
+        </w:rPr>
+      </w:pPr>
+      <w:r>
+        <w:rPr>
+          <w:lang w:val="en-US"/>
+        </w:rPr>
+        <w:t>Goal:</w:t>
+      </w:r>
+    </w:p>
+    <w:p>
+      <w:pPr>
+        <w:rPr>
+          <w:lang w:val="en-US"/>
+        </w:rPr>
+      </w:pPr>
+      <w:r>
+        <w:rPr>
+          <w:lang w:val="en-US"/>
+        </w:rPr>
+        <w:t>Implement Factory Core</w:t>
+      </w:r>
+    </w:p>
+    <w:p>
+      <w:pPr>
+        <w:rPr>
+          <w:lang w:val="en-US"/>
+        </w:rPr>
+      </w:pPr>
+    </w:p>
+    <w:p>
+      <w:pPr>
+        <w:rPr>
+          <w:lang w:val="en-US"/>
+        </w:rPr>
+      </w:pPr>
+      <w:r>
+        <w:rPr>
+          <w:lang w:val="en-US"/>
+        </w:rPr>
+        <w:t>Tasks:</w:t>
+      </w:r>
+    </w:p>
+    <w:p>
+      <w:pPr>
+        <w:rPr>
+          <w:lang w:val="en-US"/>
+        </w:rPr>
+      </w:pPr>
+    </w:p>
+    <w:p>
+      <w:pPr>
+        <w:rPr>
+          <w:lang w:val="en-US"/>
+        </w:rPr>
+      </w:pPr>
+      <w:r>
+        <w:rPr>
+          <w:lang w:val="en-US"/>
+        </w:rPr>
+        <w:t>[ ] Application</w:t>
+      </w:r>
+    </w:p>
+    <w:p>
+      <w:pPr>
+        <w:rPr>
+          <w:lang w:val="en-US"/>
+        </w:rPr>
+      </w:pPr>
+      <w:r>
+        <w:rPr>
+          <w:lang w:val="en-US"/>
+        </w:rPr>
+        <w:t>[ ] Project</w:t>
+      </w:r>
+    </w:p>
+    <w:p>
+      <w:pPr>
+        <w:rPr>
+          <w:lang w:val="en-US"/>
+        </w:rPr>
+      </w:pPr>
+      <w:r>
+        <w:rPr>
+          <w:lang w:val="en-US"/>
+        </w:rPr>
+        <w:t>[ ] Component</w:t>
+      </w:r>
+    </w:p>
+    <w:p>
+      <w:pPr>
+        <w:rPr>
+          <w:lang w:val="en-US"/>
+        </w:rPr>
+      </w:pPr>
+      <w:r>
+        <w:rPr>
+          <w:lang w:val="en-US"/>
+        </w:rPr>
+        <w:t>[ ] Tests</w:t>
+      </w:r>
+    </w:p>
+    <w:p>
+      <w:pPr>
+        <w:rPr>
+          <w:lang w:val="en-US"/>
+        </w:rPr>
+      </w:pPr>
+      <w:r>
+        <w:rPr>
+          <w:lang w:val="en-US"/>
+        </w:rPr>
+        <w:t>[ ] Documentation</w:t>
+      </w:r>
+    </w:p>
+    <w:p>
+      <w:pPr>
+        <w:rPr>
+          <w:lang w:val="en-US"/>
+        </w:rPr>
+      </w:pPr>
+    </w:p>
+    <w:p>
+      <w:r>
+        <w:t>Status:</w:t>
+      </w:r>
+    </w:p>
+    <w:p>
+      <w:r>
+        <w:t>0%</w:t>
+      </w:r>
+    </w:p>
+    <w:p>
+      <w:r>
+        <w:t>To będzie pierwszy "mózg" Factory.</w:t>
+      </w:r>
+    </w:p>
+    <w:p>
+      <w:r>
+        <w:pict w14:anchorId="475CE7A3">
+          <v:rect id="_x0000_i1072" style="width:0;height:1.5pt" o:hralign="center" o:hrstd="t" o:hr="t" fillcolor="#a0a0a0" stroked="f"/>
+        </w:pict>
+      </w:r>
+    </w:p>
+    <w:p>
+      <w:pPr>
+        <w:rPr>
+          <w:b/>
+          <w:bCs/>
+        </w:rPr>
+      </w:pPr>
+      <w:r>
+        <w:rPr>
+          <w:b/>
+          <w:bCs/>
+        </w:rPr>
+        <w:t>Proponuję nową roadmapę</w:t>
+      </w:r>
+    </w:p>
+    <w:p>
+      <w:pPr>
+        <w:rPr>
+          <w:b/>
+          <w:bCs/>
+        </w:rPr>
+      </w:pPr>
+      <w:r>
+        <w:rPr>
+          <w:b/>
+          <w:bCs/>
+        </w:rPr>
+        <w:t>Sprint F-003</w:t>
+      </w:r>
+    </w:p>
+    <w:p>
+      <w:r>
+        <w:rPr>
+          <w:rFonts w:ascii="Segoe UI Emoji" w:hAnsi="Segoe UI Emoji" w:cs="Segoe UI Emoji"/>
+        </w:rPr>
+        <w:t>📄</w:t>
+      </w:r>
+      <w:r>
+        <w:t xml:space="preserve"> Konstytucja projektu</w:t>
+      </w:r>
+    </w:p>
+    <w:p>
+      <w:pPr>
+        <w:numPr>
+          <w:ilvl w:val="0"/>
+          <w:numId w:val="3"/>
+        </w:numPr>
+      </w:pPr>
+      <w:r>
+        <w:t xml:space="preserve">VISION </w:t>
+      </w:r>
+    </w:p>
+    <w:p>
+      <w:pPr>
+        <w:numPr>
+          <w:ilvl w:val="0"/>
+          <w:numId w:val="3"/>
+        </w:numPr>
+      </w:pPr>
+      <w:r>
+        <w:t xml:space="preserve">ARCHITECTURE </w:t>
+      </w:r>
+    </w:p>
+    <w:p>
+      <w:pPr>
+        <w:numPr>
+          <w:ilvl w:val="0"/>
+          <w:numId w:val="3"/>
+        </w:numPr>
+      </w:pPr>
+      <w:r>
+        <w:t xml:space="preserve">ROADMAP </w:t>
+      </w:r>
+    </w:p>
+    <w:p>
+      <w:pPr>
+        <w:rPr>
+          <w:b/>
+          <w:bCs/>
+        </w:rPr>
+      </w:pPr>
+      <w:r>
+        <w:rPr>
+          <w:b/>
+          <w:bCs/>
+        </w:rPr>
+        <w:t>Sprint F-004</w:t>
+      </w:r>
+    </w:p>
+    <w:p>
+      <w:r>
+        <w:rPr>
+          <w:rFonts w:ascii="Segoe UI Emoji" w:hAnsi="Segoe UI Emoji" w:cs="Segoe UI Emoji"/>
+        </w:rPr>
+        <w:t>⚙️</w:t>
+      </w:r>
+      <w:r>
+        <w:t xml:space="preserve"> Foundation Core</w:t>
+      </w:r>
+    </w:p>
+    <w:p>
+      <w:pPr>
+        <w:rPr>
+          <w:b/>
+          <w:bCs/>
+        </w:rPr>
+      </w:pPr>
+      <w:r>
+        <w:rPr>
+          <w:b/>
+          <w:bCs/>
+        </w:rPr>
+        <w:t>Sprint F-005</w:t>
+      </w:r>
+    </w:p>
+    <w:p>
+      <w:r>
+        <w:rPr>
+          <w:rFonts w:ascii="Segoe UI Emoji" w:hAnsi="Segoe UI Emoji" w:cs="Segoe UI Emoji"/>
+        </w:rPr>
+        <w:t>🧠</w:t>
+      </w:r>
+      <w:r>
+        <w:t xml:space="preserve"> Agent Core</w:t>
+      </w:r>
+    </w:p>
+    <w:p>
+      <w:pPr>
+        <w:rPr>
+          <w:b/>
+          <w:bCs/>
+        </w:rPr>
+      </w:pPr>
+      <w:r>
+        <w:rPr>
+          <w:b/>
+          <w:bCs/>
+        </w:rPr>
+        <w:t>Sprint F-006</w:t>
+      </w:r>
+    </w:p>
+    <w:p>
+      <w:r>
+        <w:rPr>
+          <w:rFonts w:ascii="Segoe UI Emoji" w:hAnsi="Segoe UI Emoji" w:cs="Segoe UI Emoji"/>
+        </w:rPr>
+        <w:t>📋</w:t>
+      </w:r>
+      <w:r>
+        <w:t xml:space="preserve"> Task Engine</w:t>
+      </w:r>
+    </w:p>
+    <w:p>
+      <w:pPr>
+        <w:rPr>
+          <w:b/>
+          <w:bCs/>
+        </w:rPr>
+      </w:pPr>
+      <w:r>
+        <w:rPr>
+          <w:b/>
+          <w:bCs/>
+        </w:rPr>
+        <w:t>Sprint F-007</w:t>
+      </w:r>
+    </w:p>
+    <w:p>
+      <w:r>
+        <w:rPr>
+          <w:rFonts w:ascii="Segoe UI Emoji" w:hAnsi="Segoe UI Emoji" w:cs="Segoe UI Emoji"/>
+        </w:rPr>
+        <w:t>🔌</w:t>
+      </w:r>
+      <w:r>
+        <w:t xml:space="preserve"> Plugin System</w:t>
+      </w:r>
+    </w:p>
+    <w:p>
+      <w:pPr>
+        <w:rPr>
+          <w:b/>
+          <w:bCs/>
+        </w:rPr>
+      </w:pPr>
+      <w:r>
+        <w:rPr>
+          <w:b/>
+          <w:bCs/>
+        </w:rPr>
+        <w:t>Sprint F-008</w:t>
+      </w:r>
+    </w:p>
+    <w:p>
+      <w:r>
+        <w:rPr>
+          <w:rFonts w:ascii="Segoe UI Emoji" w:hAnsi="Segoe UI Emoji" w:cs="Segoe UI Emoji"/>
+        </w:rPr>
+        <w:t>🐙</w:t>
+      </w:r>
+      <w:r>
+        <w:t xml:space="preserve"> Git Plugin</w:t>
+      </w:r>
+    </w:p>
+    <w:p>
+      <w:pPr>
+        <w:rPr>
+          <w:b/>
+          <w:bCs/>
+        </w:rPr>
+      </w:pPr>
+      <w:r>
+        <w:rPr>
+          <w:b/>
+          <w:bCs/>
+        </w:rPr>
+        <w:t>Sprint F-009</w:t>
+      </w:r>
+    </w:p>
+    <w:p>
+      <w:r>
+        <w:rPr>
+          <w:rFonts w:ascii="Segoe UI Emoji" w:hAnsi="Segoe UI Emoji" w:cs="Segoe UI Emoji"/>
+        </w:rPr>
+        <w:t>🚀</w:t>
+      </w:r>
+      <w:r>
+        <w:t xml:space="preserve"> Smart Automation</w:t>
+      </w:r>
+    </w:p>
+    <w:p>
+      <w:r>
+        <w:pict w14:anchorId="522F3054">
+          <v:rect id="_x0000_i1073" style="width:0;height:1.5pt" o:hralign="center" o:hrstd="t" o:hr="t" fillcolor="#a0a0a0" stroked="f"/>
+        </w:pict>
+      </w:r>
+    </w:p>
+    <w:p>
+      <w:pPr>
+        <w:rPr>
+          <w:b/>
+          <w:bCs/>
+        </w:rPr>
+      </w:pPr>
+      <w:r>
+        <w:rPr>
+          <w:b/>
+          <w:bCs/>
+        </w:rPr>
+        <w:lastRenderedPageBreak/>
+        <w:t>To będzie nasza zasada</w:t>
+      </w:r>
+    </w:p>
+    <w:p>
+      <w:r>
+        <w:t>Od dziś każde pytanie będziemy zadawać w ten sposób:</w:t>
+      </w:r>
+    </w:p>
+    <w:p>
+      <w:r>
+        <w:rPr>
+          <w:b/>
+          <w:bCs/>
+        </w:rPr>
+        <w:t>"Czy ta funkcja jest potrzebna teraz do zbudowania fundamentów?"</w:t>
+      </w:r>
+    </w:p>
+    <w:p>
+      <w:r>
+        <w:t xml:space="preserve">Jeśli odpowiedź brzmi </w:t>
+      </w:r>
+      <w:r>
+        <w:rPr>
+          <w:b/>
+          <w:bCs/>
+        </w:rPr>
+        <w:t>nie</w:t>
+      </w:r>
+      <w:r>
+        <w:t>, odkładamy ją do odpowiedniego sprintu.</w:t>
+      </w:r>
+    </w:p>
+    <w:p>
+      <w:r>
+        <w:t>To pozwoli nam uniknąć bałaganu architektonicznego i sprawi, że KOS Factory będzie rozwijał się w sposób uporządkowany, a nie jako zbiór przypadkowych funkcji.</w:t>
+      </w:r>
+    </w:p>
+    <w:p>
+      <w:r>
+        <w:rPr>
+          <w:b/>
+          <w:bCs/>
+        </w:rPr>
+        <w:t>Moja decyzja jako architekta projektu jest więc taka:</w:t>
+      </w:r>
+    </w:p>
+    <w:p>
+      <w:r>
+        <w:rPr>
+          <w:rFonts w:ascii="Segoe UI Emoji" w:hAnsi="Segoe UI Emoji" w:cs="Segoe UI Emoji"/>
+        </w:rPr>
+        <w:t>➡️</w:t>
+      </w:r>
+      <w:r>
+        <w:t xml:space="preserve"> </w:t>
+      </w:r>
+      <w:r>
+        <w:rPr>
+          <w:b/>
+          <w:bCs/>
+        </w:rPr>
+        <w:t>Automatyzację Git budujemy później (Sprint F-008).</w:t>
+      </w:r>
+    </w:p>
+    <w:p>
+      <w:r>
+        <w:rPr>
+          <w:rFonts w:ascii="Segoe UI Emoji" w:hAnsi="Segoe UI Emoji" w:cs="Segoe UI Emoji"/>
+        </w:rPr>
+        <w:t>➡️</w:t>
+      </w:r>
+      <w:r>
+        <w:t xml:space="preserve"> </w:t>
+      </w:r>
+      <w:r>
+        <w:rPr>
+          <w:b/>
+          <w:bCs/>
+        </w:rPr>
+        <w:t>Teraz budujemy Foundation i Agent Core</w:t>
+      </w:r>
+      <w:r>
+        <w:t>, bo na nich będzie opierało się wszystko, co stworzymy później. To inwestycja, która sprawi, że kolejne funkcje będą prostsze do dodania i utrzymania.</w:t>
+      </w:r>
+    </w:p>
+    <w:p>
+      <w:pPr>
+        <w:rPr>
+          <w:vanish/>
+        </w:rPr>
+      </w:pPr>
+      <w:r>
+        <w:rPr>
+          <w:vanish/>
+        </w:rPr>
+        <w:t>Początek formularza</w:t>
+      </w:r>
+    </w:p>
+    <w:p/>
+    <w:p>
+      <w:pPr>
+        <w:rPr>
+          <w:vanish/>
+        </w:rPr>
+      </w:pPr>
+      <w:r>
+        <w:rPr>
+          <w:vanish/>
+        </w:rPr>
+        <w:t>Dół formularza</w:t>
+      </w:r>
+    </w:p>
+    <w:p/>
     <w:p/>
     <w:sectPr>
       <w:pgSz w:w="11906" w:h="16838"/>
@@ -96,9 +1413,9 @@
 <file path=word/numbering.xml><?xml version="1.0" encoding="utf-8"?>
 <w:numbering xmlns:wpc="http://schemas.microsoft.com/office/word/2010/wordprocessingCanvas" xmlns:cx="http://schemas.microsoft.com/office/drawing/2014/chartex" xmlns:cx1="http://schemas.microsoft.com/office/drawing/2015/9/8/chartex" xmlns:cx2="http://schemas.microsoft.com/office/drawing/2015/10/21/chartex" xmlns:cx3="http://schemas.microsoft.com/office/drawing/2016/5/9/chartex" xmlns:cx4="http://schemas.microsoft.com/office/drawing/2016/5/10/chartex" xmlns:cx5="http://schemas.microsoft.com/office/drawing/2016/5/11/chartex" xmlns:cx6="http://schemas.microsoft.com/office/drawing/2016/5/12/chartex" xmlns:cx7="http://schemas.microsoft.com/office/drawing/2016/5/13/chartex" xmlns:cx8="http://schemas.microsoft.com/office/drawing/2016/5/14/chartex" xmlns:mc="http://schemas.openxmlformats.org/markup-compatibility/2006" xmlns:aink="http://schemas.microsoft.com/office/drawing/2016/ink" xmlns:am3d="http://schemas.microsoft.com/office/drawing/2017/model3d" xmlns:o="urn:schemas-microsoft-com:office:office" xmlns:oel="http://schemas.microsoft.com/office/2019/extlst" xmlns:r="http://schemas.openxmlformats.org/officeDocument/2006/relationships" xmlns:m="http://schemas.openxmlformats.org/officeDocument/2006/math" xmlns:v="urn:schemas-microsoft-com:vml" xmlns:wp14="http://schemas.microsoft.com/office/word/2010/wordprocessingDrawing" xmlns:wp="http://schemas.openxmlformats.org/drawingml/2006/wordprocessingDrawing" xmlns:w10="urn:schemas-microsoft-com:office:word" xmlns:w="http://schemas.openxmlformats.org/wordprocessingml/2006/main" xmlns:w14="http://schemas.microsoft.com/office/word/2010/wordml" xmlns:w15="http://schemas.microsoft.com/office/word/2012/wordml" xmlns:w16cex="http://schemas.microsoft.com/office/word/2018/wordml/cex" xmlns:w16cid="http://schemas.microsoft.com/office/word/2016/wordml/cid" xmlns:w16="http://schemas.microsoft.com/office/word/2018/wordml" xmlns:w16du="http://schemas.microsoft.com/office/word/2023/wordml/word16du" xmlns:w16sdtdh="http://schemas.microsoft.com/office/word/2020/wordml/sdtdatahash" xmlns:w16sdtfl="http://schemas.microsoft.com/office/word/2024/wordml/sdtformatlock" xmlns:w16se="http://schemas.microsoft.com/office/word/2015/wordml/symex" xmlns:wpg="http://schemas.microsoft.com/office/word/2010/wordprocessingGroup" xmlns:wpi="http://schemas.microsoft.com/office/word/2010/wordprocessingInk" xmlns:wne="http://schemas.microsoft.com/office/word/2006/wordml" xmlns:wps="http://schemas.microsoft.com/office/word/2010/wordprocessingShape" mc:Ignorable="w14 w15 w16se w16cid w16 w16cex w16sdtdh w16sdtfl w16du wp14">
   <w:abstractNum w:abstractNumId="0" w15:restartNumberingAfterBreak="0">
-    <w:nsid w:val="5A7A5270"/>
+    <w:nsid w:val="2F2A0F10"/>
     <w:multiLevelType w:val="multilevel"/>
-    <w:tmpl w:val="B5EA48D4"/>
+    <w:tmpl w:val="F2E85132"/>
     <w:lvl w:ilvl="0">
       <w:start w:val="1"/>
       <w:numFmt w:val="bullet"/>
@@ -244,8 +1561,312 @@
       </w:rPr>
     </w:lvl>
   </w:abstractNum>
+  <w:abstractNum w:abstractNumId="1" w15:restartNumberingAfterBreak="0">
+    <w:nsid w:val="4715391D"/>
+    <w:multiLevelType w:val="multilevel"/>
+    <w:tmpl w:val="8D321A3A"/>
+    <w:lvl w:ilvl="0">
+      <w:start w:val="1"/>
+      <w:numFmt w:val="bullet"/>
+      <w:lvlText w:val=""/>
+      <w:lvlJc w:val="left"/>
+      <w:pPr>
+        <w:tabs>
+          <w:tab w:val="num" w:pos="720"/>
+        </w:tabs>
+        <w:ind w:left="720" w:hanging="360"/>
+      </w:pPr>
+      <w:rPr>
+        <w:rFonts w:ascii="Symbol" w:hAnsi="Symbol" w:hint="default"/>
+        <w:sz w:val="20"/>
+      </w:rPr>
+    </w:lvl>
+    <w:lvl w:ilvl="1" w:tentative="1">
+      <w:start w:val="1"/>
+      <w:numFmt w:val="bullet"/>
+      <w:lvlText w:val="o"/>
+      <w:lvlJc w:val="left"/>
+      <w:pPr>
+        <w:tabs>
+          <w:tab w:val="num" w:pos="1440"/>
+        </w:tabs>
+        <w:ind w:left="1440" w:hanging="360"/>
+      </w:pPr>
+      <w:rPr>
+        <w:rFonts w:ascii="Courier New" w:hAnsi="Courier New" w:hint="default"/>
+        <w:sz w:val="20"/>
+      </w:rPr>
+    </w:lvl>
+    <w:lvl w:ilvl="2" w:tentative="1">
+      <w:start w:val="1"/>
+      <w:numFmt w:val="bullet"/>
+      <w:lvlText w:val=""/>
+      <w:lvlJc w:val="left"/>
+      <w:pPr>
+        <w:tabs>
+          <w:tab w:val="num" w:pos="2160"/>
+        </w:tabs>
+        <w:ind w:left="2160" w:hanging="360"/>
+      </w:pPr>
+      <w:rPr>
+        <w:rFonts w:ascii="Wingdings" w:hAnsi="Wingdings" w:hint="default"/>
+        <w:sz w:val="20"/>
+      </w:rPr>
+    </w:lvl>
+    <w:lvl w:ilvl="3" w:tentative="1">
+      <w:start w:val="1"/>
+      <w:numFmt w:val="bullet"/>
+      <w:lvlText w:val=""/>
+      <w:lvlJc w:val="left"/>
+      <w:pPr>
+        <w:tabs>
+          <w:tab w:val="num" w:pos="2880"/>
+        </w:tabs>
+        <w:ind w:left="2880" w:hanging="360"/>
+      </w:pPr>
+      <w:rPr>
+        <w:rFonts w:ascii="Wingdings" w:hAnsi="Wingdings" w:hint="default"/>
+        <w:sz w:val="20"/>
+      </w:rPr>
+    </w:lvl>
+    <w:lvl w:ilvl="4" w:tentative="1">
+      <w:start w:val="1"/>
+      <w:numFmt w:val="bullet"/>
+      <w:lvlText w:val=""/>
+      <w:lvlJc w:val="left"/>
+      <w:pPr>
+        <w:tabs>
+          <w:tab w:val="num" w:pos="3600"/>
+        </w:tabs>
+        <w:ind w:left="3600" w:hanging="360"/>
+      </w:pPr>
+      <w:rPr>
+        <w:rFonts w:ascii="Wingdings" w:hAnsi="Wingdings" w:hint="default"/>
+        <w:sz w:val="20"/>
+      </w:rPr>
+    </w:lvl>
+    <w:lvl w:ilvl="5" w:tentative="1">
+      <w:start w:val="1"/>
+      <w:numFmt w:val="bullet"/>
+      <w:lvlText w:val=""/>
+      <w:lvlJc w:val="left"/>
+      <w:pPr>
+        <w:tabs>
+          <w:tab w:val="num" w:pos="4320"/>
+        </w:tabs>
+        <w:ind w:left="4320" w:hanging="360"/>
+      </w:pPr>
+      <w:rPr>
+        <w:rFonts w:ascii="Wingdings" w:hAnsi="Wingdings" w:hint="default"/>
+        <w:sz w:val="20"/>
+      </w:rPr>
+    </w:lvl>
+    <w:lvl w:ilvl="6" w:tentative="1">
+      <w:start w:val="1"/>
+      <w:numFmt w:val="bullet"/>
+      <w:lvlText w:val=""/>
+      <w:lvlJc w:val="left"/>
+      <w:pPr>
+        <w:tabs>
+          <w:tab w:val="num" w:pos="5040"/>
+        </w:tabs>
+        <w:ind w:left="5040" w:hanging="360"/>
+      </w:pPr>
+      <w:rPr>
+        <w:rFonts w:ascii="Wingdings" w:hAnsi="Wingdings" w:hint="default"/>
+        <w:sz w:val="20"/>
+      </w:rPr>
+    </w:lvl>
+    <w:lvl w:ilvl="7" w:tentative="1">
+      <w:start w:val="1"/>
+      <w:numFmt w:val="bullet"/>
+      <w:lvlText w:val=""/>
+      <w:lvlJc w:val="left"/>
+      <w:pPr>
+        <w:tabs>
+          <w:tab w:val="num" w:pos="5760"/>
+        </w:tabs>
+        <w:ind w:left="5760" w:hanging="360"/>
+      </w:pPr>
+      <w:rPr>
+        <w:rFonts w:ascii="Wingdings" w:hAnsi="Wingdings" w:hint="default"/>
+        <w:sz w:val="20"/>
+      </w:rPr>
+    </w:lvl>
+    <w:lvl w:ilvl="8" w:tentative="1">
+      <w:start w:val="1"/>
+      <w:numFmt w:val="bullet"/>
+      <w:lvlText w:val=""/>
+      <w:lvlJc w:val="left"/>
+      <w:pPr>
+        <w:tabs>
+          <w:tab w:val="num" w:pos="6480"/>
+        </w:tabs>
+        <w:ind w:left="6480" w:hanging="360"/>
+      </w:pPr>
+      <w:rPr>
+        <w:rFonts w:ascii="Wingdings" w:hAnsi="Wingdings" w:hint="default"/>
+        <w:sz w:val="20"/>
+      </w:rPr>
+    </w:lvl>
+  </w:abstractNum>
+  <w:abstractNum w:abstractNumId="2" w15:restartNumberingAfterBreak="0">
+    <w:nsid w:val="5A7A5270"/>
+    <w:multiLevelType w:val="multilevel"/>
+    <w:tmpl w:val="B5EA48D4"/>
+    <w:lvl w:ilvl="0">
+      <w:start w:val="1"/>
+      <w:numFmt w:val="bullet"/>
+      <w:lvlText w:val=""/>
+      <w:lvlJc w:val="left"/>
+      <w:pPr>
+        <w:tabs>
+          <w:tab w:val="num" w:pos="720"/>
+        </w:tabs>
+        <w:ind w:left="720" w:hanging="360"/>
+      </w:pPr>
+      <w:rPr>
+        <w:rFonts w:ascii="Symbol" w:hAnsi="Symbol" w:hint="default"/>
+        <w:sz w:val="20"/>
+      </w:rPr>
+    </w:lvl>
+    <w:lvl w:ilvl="1" w:tentative="1">
+      <w:start w:val="1"/>
+      <w:numFmt w:val="bullet"/>
+      <w:lvlText w:val="o"/>
+      <w:lvlJc w:val="left"/>
+      <w:pPr>
+        <w:tabs>
+          <w:tab w:val="num" w:pos="1440"/>
+        </w:tabs>
+        <w:ind w:left="1440" w:hanging="360"/>
+      </w:pPr>
+      <w:rPr>
+        <w:rFonts w:ascii="Courier New" w:hAnsi="Courier New" w:hint="default"/>
+        <w:sz w:val="20"/>
+      </w:rPr>
+    </w:lvl>
+    <w:lvl w:ilvl="2" w:tentative="1">
+      <w:start w:val="1"/>
+      <w:numFmt w:val="bullet"/>
+      <w:lvlText w:val=""/>
+      <w:lvlJc w:val="left"/>
+      <w:pPr>
+        <w:tabs>
+          <w:tab w:val="num" w:pos="2160"/>
+        </w:tabs>
+        <w:ind w:left="2160" w:hanging="360"/>
+      </w:pPr>
+      <w:rPr>
+        <w:rFonts w:ascii="Wingdings" w:hAnsi="Wingdings" w:hint="default"/>
+        <w:sz w:val="20"/>
+      </w:rPr>
+    </w:lvl>
+    <w:lvl w:ilvl="3" w:tentative="1">
+      <w:start w:val="1"/>
+      <w:numFmt w:val="bullet"/>
+      <w:lvlText w:val=""/>
+      <w:lvlJc w:val="left"/>
+      <w:pPr>
+        <w:tabs>
+          <w:tab w:val="num" w:pos="2880"/>
+        </w:tabs>
+        <w:ind w:left="2880" w:hanging="360"/>
+      </w:pPr>
+      <w:rPr>
+        <w:rFonts w:ascii="Wingdings" w:hAnsi="Wingdings" w:hint="default"/>
+        <w:sz w:val="20"/>
+      </w:rPr>
+    </w:lvl>
+    <w:lvl w:ilvl="4" w:tentative="1">
+      <w:start w:val="1"/>
+      <w:numFmt w:val="bullet"/>
+      <w:lvlText w:val=""/>
+      <w:lvlJc w:val="left"/>
+      <w:pPr>
+        <w:tabs>
+          <w:tab w:val="num" w:pos="3600"/>
+        </w:tabs>
+        <w:ind w:left="3600" w:hanging="360"/>
+      </w:pPr>
+      <w:rPr>
+        <w:rFonts w:ascii="Wingdings" w:hAnsi="Wingdings" w:hint="default"/>
+        <w:sz w:val="20"/>
+      </w:rPr>
+    </w:lvl>
+    <w:lvl w:ilvl="5" w:tentative="1">
+      <w:start w:val="1"/>
+      <w:numFmt w:val="bullet"/>
+      <w:lvlText w:val=""/>
+      <w:lvlJc w:val="left"/>
+      <w:pPr>
+        <w:tabs>
+          <w:tab w:val="num" w:pos="4320"/>
+        </w:tabs>
+        <w:ind w:left="4320" w:hanging="360"/>
+      </w:pPr>
+      <w:rPr>
+        <w:rFonts w:ascii="Wingdings" w:hAnsi="Wingdings" w:hint="default"/>
+        <w:sz w:val="20"/>
+      </w:rPr>
+    </w:lvl>
+    <w:lvl w:ilvl="6" w:tentative="1">
+      <w:start w:val="1"/>
+      <w:numFmt w:val="bullet"/>
+      <w:lvlText w:val=""/>
+      <w:lvlJc w:val="left"/>
+      <w:pPr>
+        <w:tabs>
+          <w:tab w:val="num" w:pos="5040"/>
+        </w:tabs>
+        <w:ind w:left="5040" w:hanging="360"/>
+      </w:pPr>
+      <w:rPr>
+        <w:rFonts w:ascii="Wingdings" w:hAnsi="Wingdings" w:hint="default"/>
+        <w:sz w:val="20"/>
+      </w:rPr>
+    </w:lvl>
+    <w:lvl w:ilvl="7" w:tentative="1">
+      <w:start w:val="1"/>
+      <w:numFmt w:val="bullet"/>
+      <w:lvlText w:val=""/>
+      <w:lvlJc w:val="left"/>
+      <w:pPr>
+        <w:tabs>
+          <w:tab w:val="num" w:pos="5760"/>
+        </w:tabs>
+        <w:ind w:left="5760" w:hanging="360"/>
+      </w:pPr>
+      <w:rPr>
+        <w:rFonts w:ascii="Wingdings" w:hAnsi="Wingdings" w:hint="default"/>
+        <w:sz w:val="20"/>
+      </w:rPr>
+    </w:lvl>
+    <w:lvl w:ilvl="8" w:tentative="1">
+      <w:start w:val="1"/>
+      <w:numFmt w:val="bullet"/>
+      <w:lvlText w:val=""/>
+      <w:lvlJc w:val="left"/>
+      <w:pPr>
+        <w:tabs>
+          <w:tab w:val="num" w:pos="6480"/>
+        </w:tabs>
+        <w:ind w:left="6480" w:hanging="360"/>
+      </w:pPr>
+      <w:rPr>
+        <w:rFonts w:ascii="Wingdings" w:hAnsi="Wingdings" w:hint="default"/>
+        <w:sz w:val="20"/>
+      </w:rPr>
+    </w:lvl>
+  </w:abstractNum>
   <w:num w:numId="1" w16cid:durableId="558522178">
+    <w:abstractNumId w:val="2"/>
+  </w:num>
+  <w:num w:numId="2" w16cid:durableId="610940269">
     <w:abstractNumId w:val="0"/>
+  </w:num>
+  <w:num w:numId="3" w16cid:durableId="927812668">
+    <w:abstractNumId w:val="1"/>
   </w:num>
 </w:numbering>
 </file>

</xml_diff>